<commit_message>
Minor updates to about and resume
</commit_message>
<xml_diff>
--- a/public/Resume_FabianFroding_2022c.docx
+++ b/public/Resume_FabianFroding_2022c.docx
@@ -234,6 +234,24 @@
         <w:rPr>
           <w:rFonts w:ascii="Times New Roman" w:cs="Times New Roman" w:eastAsia="Times New Roman" w:hAnsi="Times New Roman"/>
           <w:b w:val="1"/>
+          <w:color w:val="980000"/>
+          <w:sz w:val="26"/>
+          <w:szCs w:val="26"/>
+          <w:u w:val="single"/>
+        </w:rPr>
+      </w:pPr>
+      <w:r>
+        <w:rPr>
+          <w:rtl w:val="0"/>
+        </w:rPr>
+      </w:r>
+    </w:p>
+    <w:p>
+      <w:pPr>
+        <w:ind w:left="-360" w:firstLine="0"/>
+        <w:rPr>
+          <w:rFonts w:ascii="Times New Roman" w:cs="Times New Roman" w:eastAsia="Times New Roman" w:hAnsi="Times New Roman"/>
+          <w:b w:val="1"/>
           <w:color w:val="202124"/>
           <w:highlight w:val="white"/>
           <w:u w:val="single"/>
@@ -254,7 +272,7 @@
           <w:u w:val="single"/>
           <w:rtl w:val="0"/>
         </w:rPr>
-        <w:t xml:space="preserve">Professional Skills</w:t>
+        <w:t xml:space="preserve">Skills</w:t>
       </w:r>
       <w:r>
         <w:rPr>
@@ -893,15 +911,6 @@
           <w:highlight w:val="white"/>
         </w:rPr>
       </w:pPr>
-      <w:r>
-        <w:rPr>
-          <w:rFonts w:ascii="Times New Roman" w:cs="Times New Roman" w:eastAsia="Times New Roman" w:hAnsi="Times New Roman"/>
-          <w:color w:val="202124"/>
-          <w:highlight w:val="white"/>
-          <w:rtl w:val="0"/>
-        </w:rPr>
-        <w:t xml:space="preserve">Unreal Engine Gameplay Ability System: </w:t>
-      </w:r>
       <w:hyperlink r:id="rId8">
         <w:r>
           <w:rPr>
@@ -911,7 +920,7 @@
             <w:u w:val="single"/>
             <w:rtl w:val="0"/>
           </w:rPr>
-          <w:t xml:space="preserve">Udemy Link</w:t>
+          <w:t xml:space="preserve">Unreal Engine Gameplay Ability System</w:t>
         </w:r>
       </w:hyperlink>
       <w:r>
@@ -968,17 +977,35 @@
         <w:ind w:left="-360" w:firstLine="0"/>
         <w:rPr>
           <w:rFonts w:ascii="Times New Roman" w:cs="Times New Roman" w:eastAsia="Times New Roman" w:hAnsi="Times New Roman"/>
-          <w:u w:val="single"/>
-        </w:rPr>
-      </w:pPr>
-      <w:r>
-        <w:rPr>
-          <w:rFonts w:ascii="Times New Roman" w:cs="Times New Roman" w:eastAsia="Times New Roman" w:hAnsi="Times New Roman"/>
           <w:b w:val="1"/>
           <w:color w:val="980000"/>
           <w:sz w:val="26"/>
           <w:szCs w:val="26"/>
           <w:u w:val="single"/>
+        </w:rPr>
+      </w:pPr>
+      <w:r>
+        <w:rPr>
+          <w:rtl w:val="0"/>
+        </w:rPr>
+      </w:r>
+    </w:p>
+    <w:p>
+      <w:pPr>
+        <w:ind w:left="-360" w:firstLine="0"/>
+        <w:rPr>
+          <w:rFonts w:ascii="Times New Roman" w:cs="Times New Roman" w:eastAsia="Times New Roman" w:hAnsi="Times New Roman"/>
+          <w:u w:val="single"/>
+        </w:rPr>
+      </w:pPr>
+      <w:r>
+        <w:rPr>
+          <w:rFonts w:ascii="Times New Roman" w:cs="Times New Roman" w:eastAsia="Times New Roman" w:hAnsi="Times New Roman"/>
+          <w:b w:val="1"/>
+          <w:color w:val="980000"/>
+          <w:sz w:val="26"/>
+          <w:szCs w:val="26"/>
+          <w:u w:val="single"/>
           <w:rtl w:val="0"/>
         </w:rPr>
         <w:t xml:space="preserve">Work Experience</w:t>
@@ -1028,7 +1055,7 @@
           <w:rFonts w:ascii="Times New Roman" w:cs="Times New Roman" w:eastAsia="Times New Roman" w:hAnsi="Times New Roman"/>
           <w:rtl w:val="0"/>
         </w:rPr>
-        <w:t xml:space="preserve">Lead UI programmer: created all UI systems and contributed to UI/UX design.</w:t>
+        <w:t xml:space="preserve">Developed gameplay systems and features in C++ using Unreal Engine.</w:t>
       </w:r>
     </w:p>
     <w:p>
@@ -1048,7 +1075,7 @@
           <w:rFonts w:ascii="Times New Roman" w:cs="Times New Roman" w:eastAsia="Times New Roman" w:hAnsi="Times New Roman"/>
           <w:rtl w:val="0"/>
         </w:rPr>
-        <w:t xml:space="preserve">Developed gameplay systems and networked features in C++ using Unreal Engine.</w:t>
+        <w:t xml:space="preserve">Lead UI programmer: developed all UI systems and contributed to UI/UX design.</w:t>
       </w:r>
     </w:p>
     <w:p>
@@ -1068,7 +1095,7 @@
           <w:rFonts w:ascii="Times New Roman" w:cs="Times New Roman" w:eastAsia="Times New Roman" w:hAnsi="Times New Roman"/>
           <w:rtl w:val="0"/>
         </w:rPr>
-        <w:t xml:space="preserve">Integrated third-party services including Azure Playfab and Amazon Web Services.</w:t>
+        <w:t xml:space="preserve">Integrated third-party telemetry services such as Azure Playfab and AWS.</w:t>
       </w:r>
     </w:p>
     <w:p>
@@ -1311,23 +1338,6 @@
         </w:rPr>
         <w:br w:type="textWrapping"/>
       </w:r>
-      <w:r>
-        <w:br w:type="page"/>
-      </w:r>
-      <w:r>
-        <w:rPr>
-          <w:rtl w:val="0"/>
-        </w:rPr>
-      </w:r>
-    </w:p>
-    <w:p>
-      <w:pPr>
-        <w:ind w:left="-360" w:firstLine="0"/>
-        <w:rPr>
-          <w:rFonts w:ascii="Times New Roman" w:cs="Times New Roman" w:eastAsia="Times New Roman" w:hAnsi="Times New Roman"/>
-          <w:b w:val="1"/>
-        </w:rPr>
-      </w:pPr>
       <w:r>
         <w:rPr>
           <w:rFonts w:ascii="Times New Roman" w:cs="Times New Roman" w:eastAsia="Times New Roman" w:hAnsi="Times New Roman"/>
@@ -1437,6 +1447,24 @@
           <v:rect style="width:0.0pt;height:1.5pt" o:hr="t" o:hrstd="t" o:hralign="center" fillcolor="#A0A0A0" stroked="f"/>
         </w:pict>
       </w:r>
+      <w:r>
+        <w:rPr>
+          <w:rtl w:val="0"/>
+        </w:rPr>
+      </w:r>
+    </w:p>
+    <w:p>
+      <w:pPr>
+        <w:ind w:left="-360" w:firstLine="0"/>
+        <w:rPr>
+          <w:rFonts w:ascii="Times New Roman" w:cs="Times New Roman" w:eastAsia="Times New Roman" w:hAnsi="Times New Roman"/>
+          <w:b w:val="1"/>
+          <w:color w:val="980000"/>
+          <w:sz w:val="26"/>
+          <w:szCs w:val="26"/>
+          <w:u w:val="single"/>
+        </w:rPr>
+      </w:pPr>
       <w:r>
         <w:rPr>
           <w:rtl w:val="0"/>
@@ -1683,6 +1711,24 @@
           <v:rect style="width:0.0pt;height:1.5pt" o:hr="t" o:hrstd="t" o:hralign="center" fillcolor="#A0A0A0" stroked="f"/>
         </w:pict>
       </w:r>
+      <w:r>
+        <w:rPr>
+          <w:rtl w:val="0"/>
+        </w:rPr>
+      </w:r>
+    </w:p>
+    <w:p>
+      <w:pPr>
+        <w:ind w:left="-360" w:firstLine="0"/>
+        <w:rPr>
+          <w:rFonts w:ascii="Times New Roman" w:cs="Times New Roman" w:eastAsia="Times New Roman" w:hAnsi="Times New Roman"/>
+          <w:b w:val="1"/>
+          <w:color w:val="980000"/>
+          <w:sz w:val="26"/>
+          <w:szCs w:val="26"/>
+          <w:u w:val="single"/>
+        </w:rPr>
+      </w:pPr>
       <w:r>
         <w:rPr>
           <w:rtl w:val="0"/>

</xml_diff>